<commit_message>
Add table of contents to FSA phishing-resistant MFA summary document
https://claude.ai/code/session_015CRpYGCW4Ja52w4jspEpr4
</commit_message>
<xml_diff>
--- a/FSA_フィッシング耐性MFA_官民広報_20260416.docx
+++ b/FSA_フィッシング耐性MFA_官民広報_20260416.docx
@@ -30,6 +30,107 @@
       </w:r>
     </w:p>
     <w:p/>
+    <w:p>
+      <w:pPr>
+        <w:pStyle w:val="Heading1"/>
+      </w:pPr>
+      <w:r>
+        <w:t>目次</w:t>
+      </w:r>
+    </w:p>
+    <w:p>
+      <w:r>
+        <w:fldChar w:fldCharType="begin"/>
+      </w:r>
+      <w:r>
+        <w:instrText xml:space="preserve"> TOC \o "1-2" \h \z \u </w:instrText>
+      </w:r>
+      <w:r>
+        <w:fldChar w:fldCharType="separate"/>
+      </w:r>
+      <w:r>
+        <w:rPr>
+          <w:sz w:val="22"/>
+        </w:rPr>
+        <w:t>1. 背景</w:t>
+        <w:br/>
+      </w:r>
+      <w:r>
+        <w:rPr>
+          <w:sz w:val="22"/>
+        </w:rPr>
+        <w:t>2. 連携機関</w:t>
+        <w:br/>
+      </w:r>
+      <w:r>
+        <w:rPr>
+          <w:sz w:val="22"/>
+        </w:rPr>
+        <w:t>3. 公開された広報コンテンツ</w:t>
+        <w:br/>
+      </w:r>
+      <w:r>
+        <w:rPr>
+          <w:color w:val="505050"/>
+          <w:sz w:val="20"/>
+        </w:rPr>
+        <w:t xml:space="preserve">    3.1 チラシ（5種類）</w:t>
+        <w:br/>
+      </w:r>
+      <w:r>
+        <w:rPr>
+          <w:color w:val="505050"/>
+          <w:sz w:val="20"/>
+        </w:rPr>
+        <w:t xml:space="preserve">    3.2 広報動画（4種類）</w:t>
+        <w:br/>
+      </w:r>
+      <w:r>
+        <w:rPr>
+          <w:sz w:val="22"/>
+        </w:rPr>
+        <w:t>4. メッセージの要点</w:t>
+        <w:br/>
+      </w:r>
+      <w:r>
+        <w:rPr>
+          <w:color w:val="505050"/>
+          <w:sz w:val="20"/>
+        </w:rPr>
+        <w:t xml:space="preserve">    4.1 多要素認証について</w:t>
+        <w:br/>
+      </w:r>
+      <w:r>
+        <w:rPr>
+          <w:color w:val="505050"/>
+          <w:sz w:val="20"/>
+        </w:rPr>
+        <w:t xml:space="preserve">    4.2 フィッシングメール注意喚起について</w:t>
+        <w:br/>
+      </w:r>
+      <w:r>
+        <w:rPr>
+          <w:sz w:val="22"/>
+        </w:rPr>
+        <w:t>5. 実務的な示唆</w:t>
+        <w:br/>
+      </w:r>
+      <w:r>
+        <w:rPr>
+          <w:sz w:val="22"/>
+        </w:rPr>
+        <w:t>6. 出典</w:t>
+        <w:br/>
+      </w:r>
+      <w:r>
+        <w:fldChar w:fldCharType="end"/>
+      </w:r>
+    </w:p>
+    <w:p>
+      <w:r>
+        <w:br w:type="page"/>
+      </w:r>
+    </w:p>
     <w:p>
       <w:pPr>
         <w:pStyle w:val="Heading1"/>

</xml_diff>